<commit_message>
Manuais: Meu Contrato de experiencia
Manual do Usuario: tabela dos cards da secao Contrato Temporario (Imprimir
Contrato Padrao, Imprimir Meu Contrato, Criar/Editar Meu Contrato) e passo a
passo do Meu Contrato - marcadores, negrito, data, testemunhas, previa,
clausula do prazo (90 dias, 'foi prorrogado') e aviso de responsabilidade.
Manual de Regras: os dois modelos, tab_contrato_modelo, clausula do prazo e
validacao.

Co-Authored-By: Claude Opus 5.5 <noreply@anthropic.com>
</commit_message>
<xml_diff>
--- a/manual/Manual_de_Regras_Folha10_Simples.docx
+++ b/manual/Manual_de_Regras_Folha10_Simples.docx
@@ -139,7 +139,7 @@
               <w:rPr>
                 <w:sz w:val="19"/>
               </w:rPr>
-              <w:t>20260809-1134</w:t>
+              <w:t>20260928-1103</w:t>
             </w:r>
           </w:p>
         </w:tc>
@@ -4622,7 +4622,7 @@
           <w:color w:val="475569"/>
           <w:sz w:val="19"/>
         </w:rPr>
-        <w:t>Contrato / Prorrogação · Relação dos Contratos · Imprimir Contrato de Experiência</w:t>
+        <w:t>Contrato / Prorrogação · Relação dos Contratos · Imprimir Contrato Padrão · Imprimir Meu Contrato · Criar/Editar Meu Contrato</w:t>
       </w:r>
     </w:p>
     <w:p>
@@ -4633,7 +4633,40 @@
         <w:t xml:space="preserve">Contrato de experiência — </w:t>
       </w:r>
       <w:r>
-        <w:t>o PDF é oferecido logo depois de concluir o cadastro do funcionário e também fica no card do menu. O modelo não traz os itens Local de Trabalho e Dano.</w:t>
+        <w:t>o PDF é oferecido logo depois de concluir o cadastro do funcionário e também fica no card do menu. O modelo padrão não traz os itens Local de Trabalho e Dano. Os dados (prazo, prorrogação) saem do evento op1=1/op2=167.</w:t>
+      </w:r>
+    </w:p>
+    <w:p>
+      <w:r>
+        <w:rPr>
+          <w:b/>
+        </w:rPr>
+        <w:t xml:space="preserve">Dois modelos — </w:t>
+      </w:r>
+      <w:r>
+        <w:t>o Padrão fica no app.py e está sempre disponível (/contrato_experiencia_pdf?modelo=padrao). O Meu Contrato é um por CLIENTE, em tab_contrato_modelo (JSON), montado por modelos_contrato.py. Sem ?modelo, como no PDF da admissão, sai o Meu Contrato de quem tem. O card Imprimir Meu Contrato só aparece para quem gravou o seu.</w:t>
+      </w:r>
+    </w:p>
+    <w:p>
+      <w:r>
+        <w:rPr>
+          <w:b/>
+        </w:rPr>
+        <w:t xml:space="preserve">Cláusula do prazo — </w:t>
+      </w:r>
+      <w:r>
+        <w:t>é do sistema: o cliente muda título e posição, não o texto. A prorrogação só entra se couber nos 90 dias (art. 445 CLT); contrato já prorrogado sai no passado (“foi prorrogado”), com as datas reais.</w:t>
+      </w:r>
+    </w:p>
+    <w:p>
+      <w:r>
+        <w:rPr>
+          <w:b/>
+        </w:rPr>
+        <w:t xml:space="preserve">Validação — </w:t>
+      </w:r>
+      <w:r>
+        <w:t>marcador fora da lista (os da prorrogação ficam de fora de propósito) é recusado ao gravar. O texto do cliente é escapado antes do ReportLab; negrito é **assim**. O cliente 30 foi o primeiro Meu Contrato, migrado do código em 28/09/2026.</w:t>
       </w:r>
     </w:p>
     <w:p>
@@ -9673,7 +9706,7 @@
           <w:i/>
           <w:color w:val="475569"/>
         </w:rPr>
-        <w:t>Folha10 Simples — versão 20260809-1134. Documento gerado em 09/08/2026.</w:t>
+        <w:t>Folha10 Simples — versão 20260928-1103. Documento gerado em 09/08/2026.</w:t>
       </w:r>
     </w:p>
     <w:sectPr>
@@ -9715,7 +9748,7 @@
         <w:sz w:val="17"/>
       </w:rPr>
       <w:tab/>
-      <w:t>versão 20260809-1134</w:t>
+      <w:t>versão 20260928-1103</w:t>
     </w:r>
   </w:p>
 </w:hdr>

</xml_diff>

<commit_message>
Manuais: limite de 3 usuarios ativos por cliente
Co-Authored-By: Claude Opus 5.5 <noreply@anthropic.com>
</commit_message>
<xml_diff>
--- a/manual/Manual_de_Regras_Folha10_Simples.docx
+++ b/manual/Manual_de_Regras_Folha10_Simples.docx
@@ -139,7 +139,7 @@
               <w:rPr>
                 <w:sz w:val="19"/>
               </w:rPr>
-              <w:t>20260928-1103</w:t>
+              <w:t>20261002-1002</w:t>
             </w:r>
           </w:p>
         </w:tc>
@@ -8829,6 +8829,17 @@
         <w:rPr>
           <w:b/>
         </w:rPr>
+        <w:t xml:space="preserve">Limite de usuários — </w:t>
+      </w:r>
+      <w:r>
+        <w:t>LIMITE_USUARIOS_CLIENTE = 3 ativos por cliente, o titular incluído. Conta só situacao='A': desativar libera a vaga. O titular não pode ser desativado.</w:t>
+      </w:r>
+    </w:p>
+    <w:p>
+      <w:r>
+        <w:rPr>
+          <w:b/>
+        </w:rPr>
         <w:t xml:space="preserve">Log — </w:t>
       </w:r>
       <w:r>
@@ -9706,7 +9717,7 @@
           <w:i/>
           <w:color w:val="475569"/>
         </w:rPr>
-        <w:t>Folha10 Simples — versão 20260928-1103. Documento gerado em 09/08/2026.</w:t>
+        <w:t>Folha10 Simples — versão 20261002-1002. Documento gerado em 09/08/2026.</w:t>
       </w:r>
     </w:p>
     <w:sectPr>
@@ -9748,7 +9759,7 @@
         <w:sz w:val="17"/>
       </w:rPr>
       <w:tab/>
-      <w:t>versão 20260928-1103</w:t>
+      <w:t>versão 20261002-1002</w:t>
     </w:r>
   </w:p>
 </w:hdr>

</xml_diff>